<commit_message>
adatbazis & regisztracio eltarolasa
</commit_message>
<xml_diff>
--- a/PZ VCS Dokumentálás.docx
+++ b/PZ VCS Dokumentálás.docx
@@ -1,18 +1,18 @@
 
 <file path=word/document.xml><?xml version="1.0" encoding="utf-8"?>
-<w:document xmlns:wpc="http://schemas.microsoft.com/office/word/2010/wordprocessingCanvas" xmlns:cx="http://schemas.microsoft.com/office/drawing/2014/chartex" xmlns:cx1="http://schemas.microsoft.com/office/drawing/2015/9/8/chartex" xmlns:cx2="http://schemas.microsoft.com/office/drawing/2015/10/21/chartex" xmlns:cx3="http://schemas.microsoft.com/office/drawing/2016/5/9/chartex" xmlns:cx4="http://schemas.microsoft.com/office/drawing/2016/5/10/chartex" xmlns:cx5="http://schemas.microsoft.com/office/drawing/2016/5/11/chartex" xmlns:cx6="http://schemas.microsoft.com/office/drawing/2016/5/12/chartex" xmlns:cx7="http://schemas.microsoft.com/office/drawing/2016/5/13/chartex" xmlns:cx8="http://schemas.microsoft.com/office/drawing/2016/5/14/chartex" xmlns:mc="http://schemas.openxmlformats.org/markup-compatibility/2006" xmlns:aink="http://schemas.microsoft.com/office/drawing/2016/ink" xmlns:am3d="http://schemas.microsoft.com/office/drawing/2017/model3d" xmlns:o="urn:schemas-microsoft-com:office:office" xmlns:oel="http://schemas.microsoft.com/office/2019/extlst" xmlns:r="http://schemas.openxmlformats.org/officeDocument/2006/relationships" xmlns:m="http://schemas.openxmlformats.org/officeDocument/2006/math" xmlns:v="urn:schemas-microsoft-com:vml" xmlns:wp14="http://schemas.microsoft.com/office/word/2010/wordprocessingDrawing" xmlns:wp="http://schemas.openxmlformats.org/drawingml/2006/wordprocessingDrawing" xmlns:w10="urn:schemas-microsoft-com:office:word" xmlns:w="http://schemas.openxmlformats.org/wordprocessingml/2006/main" xmlns:w14="http://schemas.microsoft.com/office/word/2010/wordml" xmlns:w15="http://schemas.microsoft.com/office/word/2012/wordml" xmlns:w16cex="http://schemas.microsoft.com/office/word/2018/wordml/cex" xmlns:w16cid="http://schemas.microsoft.com/office/word/2016/wordml/cid" xmlns:w16="http://schemas.microsoft.com/office/word/2018/wordml" xmlns:w16du="http://schemas.microsoft.com/office/word/2023/wordml/word16du" xmlns:w16sdtdh="http://schemas.microsoft.com/office/word/2020/wordml/sdtdatahash" xmlns:w16sdtfl="http://schemas.microsoft.com/office/word/2024/wordml/sdtformatlock" xmlns:w16se="http://schemas.microsoft.com/office/word/2015/wordml/symex" xmlns:wpg="http://schemas.microsoft.com/office/word/2010/wordprocessingGroup" xmlns:wpi="http://schemas.microsoft.com/office/word/2010/wordprocessingInk" xmlns:wne="http://schemas.microsoft.com/office/word/2006/wordml" xmlns:wps="http://schemas.microsoft.com/office/word/2010/wordprocessingShape" mc:Ignorable="w14 w15 w16se w16cid w16 w16cex w16sdtdh w16sdtfl w16du wp14">
+<w:document xmlns:wpc="http://schemas.microsoft.com/office/word/2010/wordprocessingCanvas" xmlns:cx="http://schemas.microsoft.com/office/drawing/2014/chartex" xmlns:cx1="http://schemas.microsoft.com/office/drawing/2015/9/8/chartex" xmlns:cx2="http://schemas.microsoft.com/office/drawing/2015/10/21/chartex" xmlns:cx3="http://schemas.microsoft.com/office/drawing/2016/5/9/chartex" xmlns:cx4="http://schemas.microsoft.com/office/drawing/2016/5/10/chartex" xmlns:cx5="http://schemas.microsoft.com/office/drawing/2016/5/11/chartex" xmlns:cx6="http://schemas.microsoft.com/office/drawing/2016/5/12/chartex" xmlns:cx7="http://schemas.microsoft.com/office/drawing/2016/5/13/chartex" xmlns:cx8="http://schemas.microsoft.com/office/drawing/2016/5/14/chartex" xmlns:mc="http://schemas.openxmlformats.org/markup-compatibility/2006" xmlns:aink="http://schemas.microsoft.com/office/drawing/2016/ink" xmlns:am3d="http://schemas.microsoft.com/office/drawing/2017/model3d" xmlns:o="urn:schemas-microsoft-com:office:office" xmlns:r="http://schemas.openxmlformats.org/officeDocument/2006/relationships" xmlns:m="http://schemas.openxmlformats.org/officeDocument/2006/math" xmlns:v="urn:schemas-microsoft-com:vml" xmlns:wp14="http://schemas.microsoft.com/office/word/2010/wordprocessingDrawing" xmlns:wp="http://schemas.openxmlformats.org/drawingml/2006/wordprocessingDrawing" xmlns:w10="urn:schemas-microsoft-com:office:word" xmlns:w="http://schemas.openxmlformats.org/wordprocessingml/2006/main" xmlns:w14="http://schemas.microsoft.com/office/word/2010/wordml" xmlns:w15="http://schemas.microsoft.com/office/word/2012/wordml" xmlns:w16cex="http://schemas.microsoft.com/office/word/2018/wordml/cex" xmlns:w16cid="http://schemas.microsoft.com/office/word/2016/wordml/cid" xmlns:w16="http://schemas.microsoft.com/office/word/2018/wordml" xmlns:w16sdtdh="http://schemas.microsoft.com/office/word/2020/wordml/sdtdatahash" xmlns:w16se="http://schemas.microsoft.com/office/word/2015/wordml/symex" xmlns:wpg="http://schemas.microsoft.com/office/word/2010/wordprocessingGroup" xmlns:wpi="http://schemas.microsoft.com/office/word/2010/wordprocessingInk" xmlns:wne="http://schemas.microsoft.com/office/word/2006/wordml" xmlns:wps="http://schemas.microsoft.com/office/word/2010/wordprocessingShape" mc:Ignorable="w14 w15 w16se w16cid w16 w16cex w16sdtdh wp14">
   <w:body>
     <w:p>
       <w:pPr>
-        <w:pStyle w:val="Title"/>
+        <w:pStyle w:val="Cm"/>
         <w:ind w:left="2832" w:firstLine="708"/>
         <w:rPr>
-          <w:rStyle w:val="Strong"/>
-        </w:rPr>
-      </w:pPr>
-      <w:r>
-        <w:rPr>
-          <w:rStyle w:val="Strong"/>
+          <w:rStyle w:val="Kiemels2"/>
+        </w:rPr>
+      </w:pPr>
+      <w:r>
+        <w:rPr>
+          <w:rStyle w:val="Kiemels2"/>
         </w:rPr>
         <w:t>Pz_Vcs</w:t>
       </w:r>
@@ -21,7 +21,7 @@
     <w:p>
       <w:pPr>
         <w:rPr>
-          <w:rStyle w:val="SubtleEmphasis"/>
+          <w:rStyle w:val="Finomkiemels"/>
           <w:i w:val="0"/>
           <w:iCs w:val="0"/>
           <w:color w:val="auto"/>
@@ -29,7 +29,7 @@
       </w:pPr>
       <w:r>
         <w:rPr>
-          <w:rStyle w:val="SubtleEmphasis"/>
+          <w:rStyle w:val="Finomkiemels"/>
           <w:sz w:val="40"/>
           <w:szCs w:val="40"/>
         </w:rPr>
@@ -37,7 +37,7 @@
       </w:r>
       <w:r>
         <w:rPr>
-          <w:rStyle w:val="SubtleEmphasis"/>
+          <w:rStyle w:val="Finomkiemels"/>
           <w:sz w:val="40"/>
           <w:szCs w:val="40"/>
         </w:rPr>
@@ -61,7 +61,7 @@
     <w:p>
       <w:pPr>
         <w:rPr>
-          <w:rStyle w:val="SubtleEmphasis"/>
+          <w:rStyle w:val="Finomkiemels"/>
           <w:sz w:val="40"/>
           <w:szCs w:val="40"/>
         </w:rPr>
@@ -405,28 +405,70 @@
         </w:rPr>
         <w:t>: 2025.09.25</w:t>
       </w:r>
-      <w:r>
-        <w:rPr>
-          <w:b/>
-          <w:bCs/>
-          <w:sz w:val="24"/>
-          <w:szCs w:val="24"/>
-        </w:rPr>
+    </w:p>
+    <w:p>
+      <w:pPr>
+        <w:rPr>
+          <w:b/>
+          <w:bCs/>
+          <w:sz w:val="24"/>
+          <w:szCs w:val="24"/>
+        </w:rPr>
+      </w:pPr>
+      <w:r>
+        <w:t xml:space="preserve">bejelentkezes gombra html oldalt csinalni PZ </w:t>
+      </w:r>
+      <w:r>
+        <w:rPr>
+          <w:b/>
+          <w:bCs/>
+          <w:sz w:val="24"/>
+          <w:szCs w:val="24"/>
+        </w:rPr>
+        <w:t>Teljesítés</w:t>
+      </w:r>
+      <w:r>
+        <w:rPr>
+          <w:b/>
+          <w:bCs/>
+          <w:sz w:val="24"/>
+          <w:szCs w:val="24"/>
+        </w:rPr>
+        <w:t>: 2025.09.25</w:t>
+      </w:r>
+    </w:p>
+    <w:p>
+      <w:pPr>
+        <w:rPr>
+          <w:b/>
+          <w:bCs/>
+          <w:sz w:val="24"/>
+          <w:szCs w:val="24"/>
+        </w:rPr>
+      </w:pPr>
+      <w:r>
+        <w:rPr>
+          <w:sz w:val="24"/>
+          <w:szCs w:val="24"/>
+        </w:rPr>
+        <w:t>regisztracios  oldal</w:t>
+      </w:r>
+      <w:r>
+        <w:rPr>
+          <w:sz w:val="24"/>
+          <w:szCs w:val="24"/>
+        </w:rPr>
+        <w:t xml:space="preserve"> css beallitasok </w:t>
+      </w:r>
+      <w:r>
+        <w:t>PZ</w:t>
+      </w:r>
+      <w:r>
+        <w:t>-Vcs</w:t>
+      </w:r>
+      <w:r>
         <w:t xml:space="preserve"> </w:t>
       </w:r>
-    </w:p>
-    <w:p>
-      <w:pPr>
-        <w:rPr>
-          <w:b/>
-          <w:bCs/>
-          <w:sz w:val="24"/>
-          <w:szCs w:val="24"/>
-        </w:rPr>
-      </w:pPr>
-      <w:r>
-        <w:t xml:space="preserve">bejelentkezes gombra html oldalt csinalni PZ </w:t>
-      </w:r>
       <w:r>
         <w:rPr>
           <w:b/>
@@ -457,25 +499,163 @@
       </w:pPr>
       <w:r>
         <w:rPr>
-          <w:sz w:val="24"/>
-          <w:szCs w:val="24"/>
-        </w:rPr>
-        <w:t>regisztracios  oldal</w:t>
-      </w:r>
-      <w:r>
-        <w:rPr>
-          <w:sz w:val="24"/>
-          <w:szCs w:val="24"/>
-        </w:rPr>
-        <w:t xml:space="preserve"> css beallitasok </w:t>
-      </w:r>
-      <w:r>
-        <w:t>PZ</w:t>
-      </w:r>
-      <w:r>
-        <w:t>-Vcs</w:t>
-      </w:r>
-      <w:r>
+          <w:b/>
+          <w:bCs/>
+          <w:sz w:val="24"/>
+          <w:szCs w:val="24"/>
+        </w:rPr>
+        <w:t xml:space="preserve">api mappa </w:t>
+      </w:r>
+      <w:r>
+        <w:rPr>
+          <w:b/>
+          <w:bCs/>
+          <w:sz w:val="24"/>
+          <w:szCs w:val="24"/>
+        </w:rPr>
+        <w:t xml:space="preserve">js fajl kepekre </w:t>
+      </w:r>
+      <w:r>
+        <w:t xml:space="preserve">PZ </w:t>
+      </w:r>
+      <w:r>
+        <w:rPr>
+          <w:b/>
+          <w:bCs/>
+          <w:sz w:val="24"/>
+          <w:szCs w:val="24"/>
+        </w:rPr>
+        <w:t>Teljesítés</w:t>
+      </w:r>
+      <w:r>
+        <w:rPr>
+          <w:b/>
+          <w:bCs/>
+          <w:sz w:val="24"/>
+          <w:szCs w:val="24"/>
+        </w:rPr>
+        <w:t>: 2025.09.25</w:t>
+      </w:r>
+    </w:p>
+    <w:p>
+      <w:pPr>
+        <w:tabs>
+          <w:tab w:val="left" w:leader="hyphen" w:pos="9072"/>
+        </w:tabs>
+      </w:pPr>
+      <w:r>
+        <w:tab/>
+      </w:r>
+    </w:p>
+    <w:p>
+      <w:pPr>
+        <w:rPr>
+          <w:sz w:val="24"/>
+          <w:szCs w:val="24"/>
+        </w:rPr>
+      </w:pPr>
+      <w:r>
+        <w:rPr>
+          <w:sz w:val="24"/>
+          <w:szCs w:val="24"/>
+        </w:rPr>
+        <w:t>feltolteni amik kesz vannak otthon</w:t>
+      </w:r>
+      <w:r>
+        <w:rPr>
+          <mc:AlternateContent>
+            <mc:Choice Requires="w16se"/>
+            <mc:Fallback>
+              <w:rFonts w:ascii="Segoe UI Emoji" w:eastAsia="Segoe UI Emoji" w:hAnsi="Segoe UI Emoji" w:cs="Segoe UI Emoji"/>
+            </mc:Fallback>
+          </mc:AlternateContent>
+          <w:sz w:val="24"/>
+          <w:szCs w:val="24"/>
+        </w:rPr>
+        <mc:AlternateContent>
+          <mc:Choice Requires="w16se">
+            <w16se:symEx w16se:font="Segoe UI Emoji" w16se:char="1F60A"/>
+          </mc:Choice>
+          <mc:Fallback>
+            <w:t>😊</w:t>
+          </mc:Fallback>
+        </mc:AlternateContent>
+      </w:r>
+    </w:p>
+    <w:p>
+      <w:pPr>
+        <w:rPr>
+          <w:sz w:val="24"/>
+          <w:szCs w:val="24"/>
+        </w:rPr>
+      </w:pPr>
+      <w:r>
+        <w:rPr>
+          <w:sz w:val="24"/>
+          <w:szCs w:val="24"/>
+        </w:rPr>
+        <w:t>get keres (felhasznalo ker egy olyat pl hogy tabla nev ez megy az apiba es api visszaadja a tabla nevet)</w:t>
+      </w:r>
+    </w:p>
+    <w:p>
+      <w:pPr>
+        <w:rPr>
+          <w:b/>
+          <w:bCs/>
+          <w:sz w:val="24"/>
+          <w:szCs w:val="24"/>
+        </w:rPr>
+      </w:pPr>
+      <w:r>
+        <w:rPr>
+          <w:sz w:val="24"/>
+          <w:szCs w:val="24"/>
+        </w:rPr>
+        <w:lastRenderedPageBreak/>
+        <w:t>apiba</w:t>
+      </w:r>
+      <w:r>
+        <w:rPr>
+          <w:sz w:val="24"/>
+          <w:szCs w:val="24"/>
+        </w:rPr>
+        <w:t>bol</w:t>
+      </w:r>
+      <w:r>
+        <w:rPr>
+          <w:sz w:val="24"/>
+          <w:szCs w:val="24"/>
+        </w:rPr>
+        <w:t xml:space="preserve"> eleres adatbazis</w:t>
+      </w:r>
+      <w:r>
+        <w:rPr>
+          <w:sz w:val="24"/>
+          <w:szCs w:val="24"/>
+        </w:rPr>
+        <w:t>t</w:t>
+      </w:r>
+      <w:r>
+        <w:rPr>
+          <w:sz w:val="24"/>
+          <w:szCs w:val="24"/>
+        </w:rPr>
+        <w:t xml:space="preserve"> regisztracio eltarolasa</w:t>
+      </w:r>
+      <w:r>
+        <w:rPr>
+          <w:sz w:val="24"/>
+          <w:szCs w:val="24"/>
+        </w:rPr>
+        <w:t xml:space="preserve"> PZ</w:t>
+      </w:r>
+      <w:r>
+        <w:rPr>
+          <w:b/>
+          <w:bCs/>
+          <w:sz w:val="24"/>
+          <w:szCs w:val="24"/>
+        </w:rPr>
         <w:t xml:space="preserve"> </w:t>
       </w:r>
       <w:r>
@@ -494,57 +674,70 @@
           <w:sz w:val="24"/>
           <w:szCs w:val="24"/>
         </w:rPr>
-        <w:t>: 2025.09.25</w:t>
-      </w:r>
-    </w:p>
-    <w:p>
-      <w:pPr>
-        <w:rPr>
-          <w:b/>
-          <w:bCs/>
-          <w:sz w:val="24"/>
-          <w:szCs w:val="24"/>
-        </w:rPr>
-      </w:pPr>
-      <w:r>
-        <w:rPr>
-          <w:b/>
-          <w:bCs/>
-          <w:sz w:val="24"/>
-          <w:szCs w:val="24"/>
-        </w:rPr>
-        <w:t xml:space="preserve">api mappa </w:t>
-      </w:r>
-      <w:r>
-        <w:rPr>
-          <w:b/>
-          <w:bCs/>
-          <w:sz w:val="24"/>
-          <w:szCs w:val="24"/>
-        </w:rPr>
-        <w:t xml:space="preserve">js fajl kepekre </w:t>
-      </w:r>
-      <w:r>
-        <w:t xml:space="preserve">PZ </w:t>
-      </w:r>
-      <w:r>
-        <w:rPr>
-          <w:b/>
-          <w:bCs/>
-          <w:sz w:val="24"/>
-          <w:szCs w:val="24"/>
-        </w:rPr>
-        <w:t>Teljesítés</w:t>
-      </w:r>
-      <w:r>
-        <w:rPr>
-          <w:b/>
-          <w:bCs/>
-          <w:sz w:val="24"/>
-          <w:szCs w:val="24"/>
-        </w:rPr>
-        <w:t>: 2025.09.25</w:t>
-      </w:r>
+        <w:t>: 2025.</w:t>
+      </w:r>
+      <w:r>
+        <w:rPr>
+          <w:b/>
+          <w:bCs/>
+          <w:sz w:val="24"/>
+          <w:szCs w:val="24"/>
+        </w:rPr>
+        <w:t>10</w:t>
+      </w:r>
+      <w:r>
+        <w:rPr>
+          <w:b/>
+          <w:bCs/>
+          <w:sz w:val="24"/>
+          <w:szCs w:val="24"/>
+        </w:rPr>
+        <w:t>.</w:t>
+      </w:r>
+      <w:r>
+        <w:rPr>
+          <w:b/>
+          <w:bCs/>
+          <w:sz w:val="24"/>
+          <w:szCs w:val="24"/>
+        </w:rPr>
+        <w:t>02</w:t>
+      </w:r>
+    </w:p>
+    <w:p>
+      <w:pPr>
+        <w:rPr>
+          <w:b/>
+          <w:bCs/>
+          <w:sz w:val="24"/>
+          <w:szCs w:val="24"/>
+        </w:rPr>
+      </w:pPr>
+      <w:r>
+        <w:rPr>
+          <w:b/>
+          <w:bCs/>
+          <w:sz w:val="24"/>
+          <w:szCs w:val="24"/>
+        </w:rPr>
+        <w:t>(tanar úr mondta hogy ez így elég!)</w:t>
+      </w:r>
+    </w:p>
+    <w:p>
+      <w:pPr>
+        <w:rPr>
+          <w:sz w:val="24"/>
+          <w:szCs w:val="24"/>
+        </w:rPr>
+      </w:pPr>
+    </w:p>
+    <w:p>
+      <w:pPr>
+        <w:rPr>
+          <w:sz w:val="24"/>
+          <w:szCs w:val="24"/>
+        </w:rPr>
+      </w:pPr>
     </w:p>
     <w:p>
       <w:pPr>
@@ -582,7 +775,6 @@
     </w:p>
     <w:p>
       <w:r>
-        <w:lastRenderedPageBreak/>
         <w:t xml:space="preserve"> </w:t>
       </w:r>
     </w:p>
@@ -597,24 +789,24 @@
     <w:p/>
     <w:p>
       <w:pPr>
-        <w:pStyle w:val="Subtitle"/>
-        <w:rPr>
-          <w:rStyle w:val="SubtleEmphasis"/>
-        </w:rPr>
-      </w:pPr>
-    </w:p>
-    <w:p>
-      <w:pPr>
-        <w:pStyle w:val="Subtitle"/>
-        <w:rPr>
-          <w:rStyle w:val="SubtleEmphasis"/>
+        <w:pStyle w:val="Alcm"/>
+        <w:rPr>
+          <w:rStyle w:val="Finomkiemels"/>
+        </w:rPr>
+      </w:pPr>
+    </w:p>
+    <w:p>
+      <w:pPr>
+        <w:pStyle w:val="Alcm"/>
+        <w:rPr>
+          <w:rStyle w:val="Finomkiemels"/>
           <w:sz w:val="40"/>
           <w:szCs w:val="40"/>
         </w:rPr>
       </w:pPr>
       <w:r>
         <w:rPr>
-          <w:rStyle w:val="SubtleEmphasis"/>
+          <w:rStyle w:val="Finomkiemels"/>
           <w:sz w:val="40"/>
           <w:szCs w:val="40"/>
         </w:rPr>
@@ -641,14 +833,14 @@
     <w:p>
       <w:pPr>
         <w:rPr>
-          <w:rStyle w:val="SubtleEmphasis"/>
+          <w:rStyle w:val="Finomkiemels"/>
           <w:sz w:val="40"/>
           <w:szCs w:val="40"/>
         </w:rPr>
       </w:pPr>
       <w:r>
         <w:rPr>
-          <w:rStyle w:val="SubtleEmphasis"/>
+          <w:rStyle w:val="Finomkiemels"/>
           <w:sz w:val="40"/>
           <w:szCs w:val="40"/>
         </w:rPr>
@@ -688,6 +880,7 @@
           <w:sz w:val="40"/>
           <w:szCs w:val="40"/>
         </w:rPr>
+        <w:lastRenderedPageBreak/>
         <w:t xml:space="preserve">Git:vegig ezt kell hasznalni </w:t>
       </w:r>
     </w:p>
@@ -704,7 +897,7 @@
 </file>
 
 <file path=word/styles.xml><?xml version="1.0" encoding="utf-8"?>
-<w:styles xmlns:mc="http://schemas.openxmlformats.org/markup-compatibility/2006" xmlns:r="http://schemas.openxmlformats.org/officeDocument/2006/relationships" xmlns:w="http://schemas.openxmlformats.org/wordprocessingml/2006/main" xmlns:w14="http://schemas.microsoft.com/office/word/2010/wordml" xmlns:w15="http://schemas.microsoft.com/office/word/2012/wordml" xmlns:w16cex="http://schemas.microsoft.com/office/word/2018/wordml/cex" xmlns:w16cid="http://schemas.microsoft.com/office/word/2016/wordml/cid" xmlns:w16="http://schemas.microsoft.com/office/word/2018/wordml" xmlns:w16du="http://schemas.microsoft.com/office/word/2023/wordml/word16du" xmlns:w16sdtdh="http://schemas.microsoft.com/office/word/2020/wordml/sdtdatahash" xmlns:w16sdtfl="http://schemas.microsoft.com/office/word/2024/wordml/sdtformatlock" xmlns:w16se="http://schemas.microsoft.com/office/word/2015/wordml/symex" mc:Ignorable="w14 w15 w16se w16cid w16 w16cex w16sdtdh w16sdtfl w16du">
+<w:styles xmlns:mc="http://schemas.openxmlformats.org/markup-compatibility/2006" xmlns:r="http://schemas.openxmlformats.org/officeDocument/2006/relationships" xmlns:w="http://schemas.openxmlformats.org/wordprocessingml/2006/main" xmlns:w14="http://schemas.microsoft.com/office/word/2010/wordml" xmlns:w15="http://schemas.microsoft.com/office/word/2012/wordml" xmlns:w16cex="http://schemas.microsoft.com/office/word/2018/wordml/cex" xmlns:w16cid="http://schemas.microsoft.com/office/word/2016/wordml/cid" xmlns:w16="http://schemas.microsoft.com/office/word/2018/wordml" xmlns:w16sdtdh="http://schemas.microsoft.com/office/word/2020/wordml/sdtdatahash" xmlns:w16se="http://schemas.microsoft.com/office/word/2015/wordml/symex" mc:Ignorable="w14 w15 w16se w16cid w16 w16cex w16sdtdh">
   <w:docDefaults>
     <w:rPrDefault>
       <w:rPr>
@@ -1098,17 +1291,17 @@
     <w:lsdException w:name="Unresolved Mention" w:semiHidden="1" w:unhideWhenUsed="1"/>
     <w:lsdException w:name="Smart Link" w:semiHidden="1" w:unhideWhenUsed="1"/>
   </w:latentStyles>
-  <w:style w:type="paragraph" w:default="1" w:styleId="Normal">
+  <w:style w:type="paragraph" w:default="1" w:styleId="Norml">
     <w:name w:val="Normal"/>
     <w:qFormat/>
   </w:style>
-  <w:style w:type="character" w:default="1" w:styleId="DefaultParagraphFont">
+  <w:style w:type="character" w:default="1" w:styleId="Bekezdsalapbettpusa">
     <w:name w:val="Default Paragraph Font"/>
     <w:uiPriority w:val="1"/>
     <w:semiHidden/>
     <w:unhideWhenUsed/>
   </w:style>
-  <w:style w:type="table" w:default="1" w:styleId="TableNormal">
+  <w:style w:type="table" w:default="1" w:styleId="Normltblzat">
     <w:name w:val="Normal Table"/>
     <w:uiPriority w:val="99"/>
     <w:semiHidden/>
@@ -1123,17 +1316,17 @@
       </w:tblCellMar>
     </w:tblPr>
   </w:style>
-  <w:style w:type="numbering" w:default="1" w:styleId="NoList">
+  <w:style w:type="numbering" w:default="1" w:styleId="Nemlista">
     <w:name w:val="No List"/>
     <w:uiPriority w:val="99"/>
     <w:semiHidden/>
     <w:unhideWhenUsed/>
   </w:style>
-  <w:style w:type="paragraph" w:styleId="Title">
+  <w:style w:type="paragraph" w:styleId="Cm">
     <w:name w:val="Title"/>
-    <w:basedOn w:val="Normal"/>
-    <w:next w:val="Normal"/>
-    <w:link w:val="TitleChar"/>
+    <w:basedOn w:val="Norml"/>
+    <w:next w:val="Norml"/>
+    <w:link w:val="CmChar"/>
     <w:uiPriority w:val="10"/>
     <w:qFormat/>
     <w:rsid w:val="00EC560D"/>
@@ -1149,10 +1342,10 @@
       <w:szCs w:val="56"/>
     </w:rPr>
   </w:style>
-  <w:style w:type="character" w:customStyle="1" w:styleId="TitleChar">
-    <w:name w:val="Title Char"/>
-    <w:basedOn w:val="DefaultParagraphFont"/>
-    <w:link w:val="Title"/>
+  <w:style w:type="character" w:customStyle="1" w:styleId="CmChar">
+    <w:name w:val="Cím Char"/>
+    <w:basedOn w:val="Bekezdsalapbettpusa"/>
+    <w:link w:val="Cm"/>
     <w:uiPriority w:val="10"/>
     <w:rsid w:val="00EC560D"/>
     <w:rPr>
@@ -1163,9 +1356,9 @@
       <w:szCs w:val="56"/>
     </w:rPr>
   </w:style>
-  <w:style w:type="character" w:styleId="SubtleEmphasis">
+  <w:style w:type="character" w:styleId="Finomkiemels">
     <w:name w:val="Subtle Emphasis"/>
-    <w:basedOn w:val="DefaultParagraphFont"/>
+    <w:basedOn w:val="Bekezdsalapbettpusa"/>
     <w:uiPriority w:val="19"/>
     <w:qFormat/>
     <w:rsid w:val="00EC560D"/>
@@ -1175,11 +1368,11 @@
       <w:color w:val="404040" w:themeColor="text1" w:themeTint="BF"/>
     </w:rPr>
   </w:style>
-  <w:style w:type="paragraph" w:styleId="Subtitle">
+  <w:style w:type="paragraph" w:styleId="Alcm">
     <w:name w:val="Subtitle"/>
-    <w:basedOn w:val="Normal"/>
-    <w:next w:val="Normal"/>
-    <w:link w:val="SubtitleChar"/>
+    <w:basedOn w:val="Norml"/>
+    <w:next w:val="Norml"/>
+    <w:link w:val="AlcmChar"/>
     <w:uiPriority w:val="11"/>
     <w:qFormat/>
     <w:rsid w:val="00EC560D"/>
@@ -1194,10 +1387,10 @@
       <w:spacing w:val="15"/>
     </w:rPr>
   </w:style>
-  <w:style w:type="character" w:customStyle="1" w:styleId="SubtitleChar">
-    <w:name w:val="Subtitle Char"/>
-    <w:basedOn w:val="DefaultParagraphFont"/>
-    <w:link w:val="Subtitle"/>
+  <w:style w:type="character" w:customStyle="1" w:styleId="AlcmChar">
+    <w:name w:val="Alcím Char"/>
+    <w:basedOn w:val="Bekezdsalapbettpusa"/>
+    <w:link w:val="Alcm"/>
     <w:uiPriority w:val="11"/>
     <w:rsid w:val="00EC560D"/>
     <w:rPr>
@@ -1206,9 +1399,9 @@
       <w:spacing w:val="15"/>
     </w:rPr>
   </w:style>
-  <w:style w:type="character" w:styleId="Strong">
+  <w:style w:type="character" w:styleId="Kiemels2">
     <w:name w:val="Strong"/>
-    <w:basedOn w:val="DefaultParagraphFont"/>
+    <w:basedOn w:val="Bekezdsalapbettpusa"/>
     <w:uiPriority w:val="22"/>
     <w:qFormat/>
     <w:rsid w:val="00EC560D"/>

</xml_diff>